<commit_message>
AI vision: rút gọn K3, K4 về phạm vi camera; bỏ chi tiết pháp luật kế toán, chuyên ngành
- K3: thay bảng thủ tục nội quy 7 bước bằng các điểm ảnh hưởng tới thời điểm bật camera,
  nhận diện (hiệu lực sau 15 ngày theo BLLĐ Đ121, khoảng chờ); cơ quan nhận hồ sơ, xử
  phạt lao động để người dùng tự tra.
- K4: thay bảng thời hạn lưu theo 9 ngành bằng một đoạn nhắc tra pháp luật chuyên ngành;
  rút gọn ghi chú về pháp luật kế toán, dân sự trong bảng gợi ý.
- K8 (A11), K10 (câu 5): bỏ liệt kê thời hạn từng ngành cho nhất quán với K4.

Co-Authored-By: Claude Opus 5.5 <noreply@anthropic.com>
Claude-Session: https://claude.ai/code/session_01Cob8EJkgsHZYQRqhfdnueU
</commit_message>
<xml_diff>
--- a/templates/09-ai-vision/k10-hoi-dap-khach-hang.docx
+++ b/templates/09-ai-vision/k10-hoi-dap-khach-hang.docx
@@ -977,43 +977,43 @@
           <w:sz w:val="26"/>
           <w:szCs w:val="26"/>
         </w:rPr>
-        <w:t xml:space="preserve">Ngoại lệ — ngành có thời hạn tối thiểu riêng</w:t>
-      </w:r>
-      <w:r>
-        <w:rPr>
-          <w:rFonts w:ascii="Times New Roman" w:cs="Times New Roman" w:eastAsia="Times New Roman" w:hAnsi="Times New Roman"/>
-          <w:b w:val="false"/>
-          <w:bCs w:val="false"/>
-          <w:i w:val="false"/>
-          <w:iCs w:val="false"/>
-          <w:sz w:val="26"/>
-          <w:szCs w:val="26"/>
-        </w:rPr>
-        <w:t xml:space="preserve"> cho nhóm camera thuộc phạm vi quy định: doanh nghiệp chế xuất (camera cổng, kho: 12 tháng, kết nối với hải quan); kho ngoại quan (12 tháng); địa điểm thu gom hàng lẻ (06 tháng); máy ATM (100 ngày); casino (06 tháng); trạm thu phí đường bộ (video làn, ảnh phương tiện 05 năm); xe ô tô kinh doanh vận tải (theo quy định về thiết bị giám sát hành trình). Doanh nghiệp thuộc các ngành này không dùng mức 30 ngày cho nhóm camera đó. </w:t>
-      </w:r>
-      <w:r>
-        <w:rPr>
-          <w:rFonts w:ascii="Times New Roman" w:cs="Times New Roman" w:eastAsia="Times New Roman" w:hAnsi="Times New Roman"/>
-          <w:b/>
-          <w:bCs/>
-          <w:i w:val="false"/>
-          <w:iCs w:val="false"/>
-          <w:sz w:val="26"/>
-          <w:szCs w:val="26"/>
-        </w:rPr>
-        <w:t xml:space="preserve">[CẦN ĐỐI CHIẾU — chưa có toàn văn trong sources/]</w:t>
-      </w:r>
-      <w:r>
-        <w:rPr>
-          <w:rFonts w:ascii="Times New Roman" w:cs="Times New Roman" w:eastAsia="Times New Roman" w:hAnsi="Times New Roman"/>
-          <w:b w:val="false"/>
-          <w:bCs w:val="false"/>
-          <w:i w:val="false"/>
-          <w:iCs w:val="false"/>
-          <w:sz w:val="26"/>
-          <w:szCs w:val="26"/>
-        </w:rPr>
-        <w:t xml:space="preserve"> — thời hạn ngành trích từ nguồn thứ cấp; đối chiếu văn bản gốc trước khi áp dụng.</w:t>
+        <w:t xml:space="preserve">Ngoại lệ:</w:t>
+      </w:r>
+      <w:r>
+        <w:rPr>
+          <w:rFonts w:ascii="Times New Roman" w:cs="Times New Roman" w:eastAsia="Times New Roman" w:hAnsi="Times New Roman"/>
+          <w:b w:val="false"/>
+          <w:bCs w:val="false"/>
+          <w:i w:val="false"/>
+          <w:iCs w:val="false"/>
+          <w:sz w:val="26"/>
+          <w:szCs w:val="26"/>
+        </w:rPr>
+        <w:t xml:space="preserve"> một số ngành có quy định riêng buộc lưu lâu hơn hoặc kết nối camera với cơ quan quản lý (ví dụ hải quan, ngân hàng, casino, trạm thu phí, vận tải). Nếu thuộc các ngành này, doanh nghiệp tra văn bản chuyên ngành và cấu hình theo đó — </w:t>
+      </w:r>
+      <w:r>
+        <w:rPr>
+          <w:rFonts w:ascii="Times New Roman" w:cs="Times New Roman" w:eastAsia="Times New Roman" w:hAnsi="Times New Roman"/>
+          <w:b/>
+          <w:bCs/>
+          <w:i w:val="false"/>
+          <w:iCs w:val="false"/>
+          <w:sz w:val="26"/>
+          <w:szCs w:val="26"/>
+        </w:rPr>
+        <w:t xml:space="preserve">[CẦN ĐỐI CHIẾU pháp luật chuyên ngành]</w:t>
+      </w:r>
+      <w:r>
+        <w:rPr>
+          <w:rFonts w:ascii="Times New Roman" w:cs="Times New Roman" w:eastAsia="Times New Roman" w:hAnsi="Times New Roman"/>
+          <w:b w:val="false"/>
+          <w:bCs w:val="false"/>
+          <w:i w:val="false"/>
+          <w:iCs w:val="false"/>
+          <w:sz w:val="26"/>
+          <w:szCs w:val="26"/>
+        </w:rPr>
+        <w:t xml:space="preserve">.</w:t>
       </w:r>
     </w:p>
     <w:p>
@@ -1044,7 +1044,7 @@
           <w:sz w:val="26"/>
           <w:szCs w:val="26"/>
         </w:rPr>
-        <w:t xml:space="preserve"> khoản 3 Điều 3, khoản 4 Điều 32 Luật BVDLCN; điểm c khoản 1 Điều 39 Nghị định 330. Văn bản ngành: Điều 28a Nghị định số 134/2016/NĐ-CP; Nghị định số 68/2016/NĐ-CP (sửa đổi bởi Nghị định số 67/2020/NĐ-CP); Thông tư số 36/2012/TT-NHNN (sửa đổi bởi Thông tư số 20/2016/TT-NHNN); Nghị định số 03/2017/NĐ-CP; Thông tư số 34/2024/TT-BGTVT. Mẫu: K4.</w:t>
+        <w:t xml:space="preserve"> khoản 3 Điều 3, khoản 4 Điều 32 Luật BVDLCN; điểm c khoản 1 Điều 39 Nghị định 330.</w:t>
       </w:r>
     </w:p>
     <w:p>

</xml_diff>

<commit_message>
AI vision: thêm K2 Mẫu E và K11 cho người lao động của đơn vị đối tác làm việc tại địa điểm
- K2 Mẫu E: thông báo, đồng ý nhận diện khuôn mặt; đồng ý riêng cho bảng tổng hợp ngày có mặt có tên và cho việc đơn vị đối tác chuyển ảnh
- K11: phụ lục hợp đồng chuyển giao dữ liệu giữa khách hàng và đơn vị đối tác, đủ 7 nội dung NĐ 356 Đ7.1
- Bản thảo luận tình huống 3.10; K8 mục C3a; K10 câu 22; P1 câu 3; danh mục, dữ liệu mẫu, bản Word

Co-Authored-By: Claude Opus 5.5 <noreply@anthropic.com>
Claude-Session: https://claude.ai/code/session_01Cob8EJkgsHZYQRqhfdnueU
</commit_message>
<xml_diff>
--- a/templates/09-ai-vision/k10-hoi-dap-khach-hang.docx
+++ b/templates/09-ai-vision/k10-hoi-dap-khach-hang.docx
@@ -4996,6 +4996,358 @@
     <w:p>
       <w:pPr>
         <w:keepNext/>
+        <w:spacing w:after="120" w:before="180" w:line="240" w:lineRule="auto"/>
+        <w:jc w:val="left"/>
+      </w:pPr>
+      <w:r>
+        <w:rPr>
+          <w:rFonts w:ascii="Times New Roman" w:cs="Times New Roman" w:eastAsia="Times New Roman" w:hAnsi="Times New Roman"/>
+          <w:b/>
+          <w:bCs/>
+          <w:i w:val="false"/>
+          <w:iCs w:val="false"/>
+          <w:caps w:val="false"/>
+          <w:sz w:val="28"/>
+          <w:szCs w:val="28"/>
+        </w:rPr>
+        <w:t xml:space="preserve">I. Người lao động của đơn vị khác làm việc tại địa điểm</w:t>
+      </w:r>
+    </w:p>
+    <w:p>
+      <w:pPr>
+        <w:spacing w:after="120" w:before="0" w:line="276" w:lineRule="auto"/>
+        <w:ind w:firstLine="566"/>
+        <w:jc w:val="both"/>
+      </w:pPr>
+      <w:r>
+        <w:rPr>
+          <w:rFonts w:ascii="Times New Roman" w:cs="Times New Roman" w:eastAsia="Times New Roman" w:hAnsi="Times New Roman"/>
+          <w:b/>
+          <w:bCs/>
+          <w:i w:val="false"/>
+          <w:iCs w:val="false"/>
+          <w:sz w:val="26"/>
+          <w:szCs w:val="26"/>
+        </w:rPr>
+        <w:t xml:space="preserve">Câu 22. Người lao động của đơn vị đối tác làm việc tại địa điểm của chúng tôi. Đơn vị đối tác gửi danh sách, ảnh để chúng tôi đăng ký khuôn mặt. Cần làm gì?</w:t>
+      </w:r>
+    </w:p>
+    <w:p>
+      <w:pPr>
+        <w:spacing w:after="60" w:before="0" w:line="276" w:lineRule="auto"/>
+        <w:ind w:left="453" w:hanging="283"/>
+        <w:jc w:val="both"/>
+      </w:pPr>
+      <w:r>
+        <w:rPr>
+          <w:rFonts w:ascii="Times New Roman" w:cs="Times New Roman" w:eastAsia="Times New Roman" w:hAnsi="Times New Roman"/>
+          <w:b w:val="false"/>
+          <w:bCs w:val="false"/>
+          <w:i w:val="false"/>
+          <w:iCs w:val="false"/>
+          <w:sz w:val="26"/>
+          <w:szCs w:val="26"/>
+        </w:rPr>
+        <w:t xml:space="preserve">- Doanh nghiệp là </w:t>
+      </w:r>
+      <w:r>
+        <w:rPr>
+          <w:rFonts w:ascii="Times New Roman" w:cs="Times New Roman" w:eastAsia="Times New Roman" w:hAnsi="Times New Roman"/>
+          <w:b/>
+          <w:bCs/>
+          <w:i w:val="false"/>
+          <w:iCs w:val="false"/>
+          <w:sz w:val="26"/>
+          <w:szCs w:val="26"/>
+        </w:rPr>
+        <w:t xml:space="preserve">bên kiểm soát</w:t>
+      </w:r>
+      <w:r>
+        <w:rPr>
+          <w:rFonts w:ascii="Times New Roman" w:cs="Times New Roman" w:eastAsia="Times New Roman" w:hAnsi="Times New Roman"/>
+          <w:b w:val="false"/>
+          <w:bCs w:val="false"/>
+          <w:i w:val="false"/>
+          <w:iCs w:val="false"/>
+          <w:sz w:val="26"/>
+          <w:szCs w:val="26"/>
+        </w:rPr>
+        <w:t xml:space="preserve"> dữ liệu khuôn mặt nhưng </w:t>
+      </w:r>
+      <w:r>
+        <w:rPr>
+          <w:rFonts w:ascii="Times New Roman" w:cs="Times New Roman" w:eastAsia="Times New Roman" w:hAnsi="Times New Roman"/>
+          <w:b/>
+          <w:bCs/>
+          <w:i w:val="false"/>
+          <w:iCs w:val="false"/>
+          <w:sz w:val="26"/>
+          <w:szCs w:val="26"/>
+        </w:rPr>
+        <w:t xml:space="preserve">không</w:t>
+      </w:r>
+      <w:r>
+        <w:rPr>
+          <w:rFonts w:ascii="Times New Roman" w:cs="Times New Roman" w:eastAsia="Times New Roman" w:hAnsi="Times New Roman"/>
+          <w:b w:val="false"/>
+          <w:bCs w:val="false"/>
+          <w:i w:val="false"/>
+          <w:iCs w:val="false"/>
+          <w:sz w:val="26"/>
+          <w:szCs w:val="26"/>
+        </w:rPr>
+        <w:t xml:space="preserve"> có hợp đồng lao động với những người này, nên không dựa vào nội quy lao động. Xin </w:t>
+      </w:r>
+      <w:r>
+        <w:rPr>
+          <w:rFonts w:ascii="Times New Roman" w:cs="Times New Roman" w:eastAsia="Times New Roman" w:hAnsi="Times New Roman"/>
+          <w:b/>
+          <w:bCs/>
+          <w:i w:val="false"/>
+          <w:iCs w:val="false"/>
+          <w:sz w:val="26"/>
+          <w:szCs w:val="26"/>
+        </w:rPr>
+        <w:t xml:space="preserve">đồng ý của từng người</w:t>
+      </w:r>
+      <w:r>
+        <w:rPr>
+          <w:rFonts w:ascii="Times New Roman" w:cs="Times New Roman" w:eastAsia="Times New Roman" w:hAnsi="Times New Roman"/>
+          <w:b w:val="false"/>
+          <w:bCs w:val="false"/>
+          <w:i w:val="false"/>
+          <w:iCs w:val="false"/>
+          <w:sz w:val="26"/>
+          <w:szCs w:val="26"/>
+        </w:rPr>
+        <w:t xml:space="preserve"> (Mẫu E), nộp trực tiếp cho doanh nghiệp; người không đồng ý ra vào bằng thẻ hoặc mã QR.</w:t>
+      </w:r>
+    </w:p>
+    <w:p>
+      <w:pPr>
+        <w:spacing w:after="60" w:before="0" w:line="276" w:lineRule="auto"/>
+        <w:ind w:left="453" w:hanging="283"/>
+        <w:jc w:val="both"/>
+      </w:pPr>
+      <w:r>
+        <w:rPr>
+          <w:rFonts w:ascii="Times New Roman" w:cs="Times New Roman" w:eastAsia="Times New Roman" w:hAnsi="Times New Roman"/>
+          <w:b w:val="false"/>
+          <w:bCs w:val="false"/>
+          <w:i w:val="false"/>
+          <w:iCs w:val="false"/>
+          <w:sz w:val="26"/>
+          <w:szCs w:val="26"/>
+        </w:rPr>
+        <w:t xml:space="preserve">- Đơn vị đối tác gửi danh sách, ảnh cho doanh nghiệp là </w:t>
+      </w:r>
+      <w:r>
+        <w:rPr>
+          <w:rFonts w:ascii="Times New Roman" w:cs="Times New Roman" w:eastAsia="Times New Roman" w:hAnsi="Times New Roman"/>
+          <w:b/>
+          <w:bCs/>
+          <w:i w:val="false"/>
+          <w:iCs w:val="false"/>
+          <w:sz w:val="26"/>
+          <w:szCs w:val="26"/>
+        </w:rPr>
+        <w:t xml:space="preserve">chuyển giao dữ liệu cá nhân</w:t>
+      </w:r>
+      <w:r>
+        <w:rPr>
+          <w:rFonts w:ascii="Times New Roman" w:cs="Times New Roman" w:eastAsia="Times New Roman" w:hAnsi="Times New Roman"/>
+          <w:b w:val="false"/>
+          <w:bCs w:val="false"/>
+          <w:i w:val="false"/>
+          <w:iCs w:val="false"/>
+          <w:sz w:val="26"/>
+          <w:szCs w:val="26"/>
+        </w:rPr>
+        <w:t xml:space="preserve">. Hai bên ký </w:t>
+      </w:r>
+      <w:r>
+        <w:rPr>
+          <w:rFonts w:ascii="Times New Roman" w:cs="Times New Roman" w:eastAsia="Times New Roman" w:hAnsi="Times New Roman"/>
+          <w:b/>
+          <w:bCs/>
+          <w:i w:val="false"/>
+          <w:iCs w:val="false"/>
+          <w:sz w:val="26"/>
+          <w:szCs w:val="26"/>
+        </w:rPr>
+        <w:t xml:space="preserve">thỏa thuận chuyển giao</w:t>
+      </w:r>
+      <w:r>
+        <w:rPr>
+          <w:rFonts w:ascii="Times New Roman" w:cs="Times New Roman" w:eastAsia="Times New Roman" w:hAnsi="Times New Roman"/>
+          <w:b w:val="false"/>
+          <w:bCs w:val="false"/>
+          <w:i w:val="false"/>
+          <w:iCs w:val="false"/>
+          <w:sz w:val="26"/>
+          <w:szCs w:val="26"/>
+        </w:rPr>
+        <w:t xml:space="preserve"> nêu mục đích, loại dữ liệu, thời hạn xóa, cơ sở pháp lý, trách nhiệm bảo vệ, thực hiện quyền của người lao động và phối hợp khi vi phạm (K11).</w:t>
+      </w:r>
+    </w:p>
+    <w:p>
+      <w:pPr>
+        <w:spacing w:after="60" w:before="0" w:line="276" w:lineRule="auto"/>
+        <w:ind w:left="453" w:hanging="283"/>
+        <w:jc w:val="both"/>
+      </w:pPr>
+      <w:r>
+        <w:rPr>
+          <w:rFonts w:ascii="Times New Roman" w:cs="Times New Roman" w:eastAsia="Times New Roman" w:hAnsi="Times New Roman"/>
+          <w:b w:val="false"/>
+          <w:bCs w:val="false"/>
+          <w:i w:val="false"/>
+          <w:iCs w:val="false"/>
+          <w:sz w:val="26"/>
+          <w:szCs w:val="26"/>
+        </w:rPr>
+        <w:t xml:space="preserve">- </w:t>
+      </w:r>
+      <w:r>
+        <w:rPr>
+          <w:rFonts w:ascii="Times New Roman" w:cs="Times New Roman" w:eastAsia="Times New Roman" w:hAnsi="Times New Roman"/>
+          <w:b/>
+          <w:bCs/>
+          <w:i w:val="false"/>
+          <w:iCs w:val="false"/>
+          <w:sz w:val="26"/>
+          <w:szCs w:val="26"/>
+        </w:rPr>
+        <w:t xml:space="preserve">Nên chụp ảnh trực tiếp tại bàn đăng ký</w:t>
+      </w:r>
+      <w:r>
+        <w:rPr>
+          <w:rFonts w:ascii="Times New Roman" w:cs="Times New Roman" w:eastAsia="Times New Roman" w:hAnsi="Times New Roman"/>
+          <w:b w:val="false"/>
+          <w:bCs w:val="false"/>
+          <w:i w:val="false"/>
+          <w:iCs w:val="false"/>
+          <w:sz w:val="26"/>
+          <w:szCs w:val="26"/>
+        </w:rPr>
+        <w:t xml:space="preserve"> thay vì nhận ảnh từ đơn vị đối tác. Nếu nhận ảnh: chỉ qua kênh mã hóa, không qua nhóm chat, thư điện tử thường; xóa tệp sau khi đăng ký.</w:t>
+      </w:r>
+    </w:p>
+    <w:p>
+      <w:pPr>
+        <w:spacing w:after="60" w:before="0" w:line="276" w:lineRule="auto"/>
+        <w:ind w:left="453" w:hanging="283"/>
+        <w:jc w:val="both"/>
+      </w:pPr>
+      <w:r>
+        <w:rPr>
+          <w:rFonts w:ascii="Times New Roman" w:cs="Times New Roman" w:eastAsia="Times New Roman" w:hAnsi="Times New Roman"/>
+          <w:b w:val="false"/>
+          <w:bCs w:val="false"/>
+          <w:i w:val="false"/>
+          <w:iCs w:val="false"/>
+          <w:sz w:val="26"/>
+          <w:szCs w:val="26"/>
+        </w:rPr>
+        <w:t xml:space="preserve">- Dùng nhật ký ra vào để đối chiếu ngày công, thanh toán với đơn vị đối tác: gửi </w:t>
+      </w:r>
+      <w:r>
+        <w:rPr>
+          <w:rFonts w:ascii="Times New Roman" w:cs="Times New Roman" w:eastAsia="Times New Roman" w:hAnsi="Times New Roman"/>
+          <w:b/>
+          <w:bCs/>
+          <w:i w:val="false"/>
+          <w:iCs w:val="false"/>
+          <w:sz w:val="26"/>
+          <w:szCs w:val="26"/>
+        </w:rPr>
+        <w:t xml:space="preserve">số liệu tổng hợp không gắn tên</w:t>
+      </w:r>
+      <w:r>
+        <w:rPr>
+          <w:rFonts w:ascii="Times New Roman" w:cs="Times New Roman" w:eastAsia="Times New Roman" w:hAnsi="Times New Roman"/>
+          <w:b w:val="false"/>
+          <w:bCs w:val="false"/>
+          <w:i w:val="false"/>
+          <w:iCs w:val="false"/>
+          <w:sz w:val="26"/>
+          <w:szCs w:val="26"/>
+        </w:rPr>
+        <w:t xml:space="preserve">; bảng có tên chỉ gồm người đã đồng ý riêng cho mục đích này.</w:t>
+      </w:r>
+    </w:p>
+    <w:p>
+      <w:pPr>
+        <w:spacing w:after="60" w:before="0" w:line="276" w:lineRule="auto"/>
+        <w:ind w:left="453" w:hanging="283"/>
+        <w:jc w:val="both"/>
+      </w:pPr>
+      <w:r>
+        <w:rPr>
+          <w:rFonts w:ascii="Times New Roman" w:cs="Times New Roman" w:eastAsia="Times New Roman" w:hAnsi="Times New Roman"/>
+          <w:b w:val="false"/>
+          <w:bCs w:val="false"/>
+          <w:i w:val="false"/>
+          <w:iCs w:val="false"/>
+          <w:sz w:val="26"/>
+          <w:szCs w:val="26"/>
+        </w:rPr>
+        <w:t xml:space="preserve">- Đơn vị đối tác phải báo khi người lao động thôi làm việc tại địa điểm để doanh nghiệp khóa quyền và xóa dữ liệu khuôn mặt.</w:t>
+      </w:r>
+    </w:p>
+    <w:p>
+      <w:pPr>
+        <w:spacing w:after="120" w:before="0" w:line="276" w:lineRule="auto"/>
+        <w:ind w:firstLine="566"/>
+        <w:jc w:val="both"/>
+      </w:pPr>
+      <w:r>
+        <w:rPr>
+          <w:rFonts w:ascii="Times New Roman" w:cs="Times New Roman" w:eastAsia="Times New Roman" w:hAnsi="Times New Roman"/>
+          <w:b w:val="false"/>
+          <w:bCs w:val="false"/>
+          <w:i w:val="false"/>
+          <w:iCs w:val="false"/>
+          <w:sz w:val="26"/>
+          <w:szCs w:val="26"/>
+        </w:rPr>
+        <w:t xml:space="preserve">Chuyển ảnh không mã hóa: 50–80 triệu đồng; thỏa thuận chuyển giao thiếu trách nhiệm các bên: 20–30 triệu đồng; dùng dữ liệu nhận qua chuyển giao cho mục đích khác: 50–80 triệu đồng.</w:t>
+      </w:r>
+    </w:p>
+    <w:p>
+      <w:pPr>
+        <w:spacing w:after="120" w:before="0" w:line="276" w:lineRule="auto"/>
+        <w:ind w:firstLine="566"/>
+        <w:jc w:val="both"/>
+      </w:pPr>
+      <w:r>
+        <w:rPr>
+          <w:rFonts w:ascii="Times New Roman" w:cs="Times New Roman" w:eastAsia="Times New Roman" w:hAnsi="Times New Roman"/>
+          <w:b w:val="false"/>
+          <w:bCs w:val="false"/>
+          <w:i/>
+          <w:iCs/>
+          <w:sz w:val="26"/>
+          <w:szCs w:val="26"/>
+        </w:rPr>
+        <w:t xml:space="preserve">Căn cứ:</w:t>
+      </w:r>
+      <w:r>
+        <w:rPr>
+          <w:rFonts w:ascii="Times New Roman" w:cs="Times New Roman" w:eastAsia="Times New Roman" w:hAnsi="Times New Roman"/>
+          <w:b w:val="false"/>
+          <w:bCs w:val="false"/>
+          <w:i w:val="false"/>
+          <w:iCs w:val="false"/>
+          <w:sz w:val="26"/>
+          <w:szCs w:val="26"/>
+        </w:rPr>
+        <w:t xml:space="preserve"> Điều 9, khoản 1 Điều 17 Luật BVDLCN; khoản 1, khoản 2 Điều 7 Nghị định 356; khoản 2 Điều 48, khoản 1 và khoản 3 Điều 52 Nghị định 330. Mẫu: K2 Mẫu E; K11.</w:t>
+      </w:r>
+    </w:p>
+    <w:p>
+      <w:pPr>
+        <w:keepNext/>
         <w:spacing w:after="180" w:before="120" w:line="240" w:lineRule="auto"/>
         <w:jc w:val="center"/>
       </w:pPr>

</xml_diff>